<commit_message>
docs(prd,spec): resolve teacher review — 250-building set, rent-stab wording, Fly.io, $0-API cost
PRD Appendix E now lists resolved decisions + F deployment/cost; spec Appendix C
records final stack (Dioxus, bundled SQLite, MapLibre+Protomaps) superseding the
pre-decision React/Tailwind/Mapbox/Shuttle mentions.

Co-Authored-By: Claude Opus 4.8 <noreply@anthropic.com>
</commit_message>
<xml_diff>
--- a/HouseCheck_PRD.docx
+++ b/HouseCheck_PRD.docx
@@ -3757,59 +3757,182 @@
           <w:sz w:val="23"/>
           <w:szCs w:val="23"/>
         </w:rPr>
-        <w:t xml:space="preserve">E. Open questions</w:t>
-      </w:r>
-    </w:p>
-    <w:p>
-      <w:pPr>
-        <w:pStyle w:val="ListParagraph"/>
-        <w:numPr>
-          <w:ilvl w:val="0"/>
-          <w:numId w:val="1"/>
-        </w:numPr>
-        <w:spacing w:after="70"/>
-      </w:pPr>
-      <w:r>
-        <w:t xml:space="preserve">Exact curated Brooklyn building list and count (50 vs 200)?</w:t>
-      </w:r>
-    </w:p>
-    <w:p>
-      <w:pPr>
-        <w:pStyle w:val="ListParagraph"/>
-        <w:numPr>
-          <w:ilvl w:val="0"/>
-          <w:numId w:val="1"/>
-        </w:numPr>
-        <w:spacing w:after="70"/>
-      </w:pPr>
-      <w:r>
-        <w:t xml:space="preserve">Rent-stabilization confidence wording — how to show "best-available, not authoritative" without eroding trust?</w:t>
-      </w:r>
-    </w:p>
-    <w:p>
-      <w:pPr>
-        <w:pStyle w:val="ListParagraph"/>
-        <w:numPr>
-          <w:ilvl w:val="0"/>
-          <w:numId w:val="1"/>
-        </w:numPr>
-        <w:spacing w:after="70"/>
-      </w:pPr>
-      <w:r>
-        <w:t xml:space="preserve">Backend hosting: Shuttle.dev vs Fly.io for the Rust API?</w:t>
-      </w:r>
-    </w:p>
-    <w:p>
-      <w:pPr>
-        <w:pStyle w:val="ListParagraph"/>
-        <w:numPr>
-          <w:ilvl w:val="0"/>
-          <w:numId w:val="1"/>
-        </w:numPr>
-        <w:spacing w:after="70"/>
-      </w:pPr>
-      <w:r>
-        <w:t xml:space="preserve">Ship quiz onboarding in the MVP, or defer to post-demo?</w:t>
+        <w:t xml:space="preserve">E. Resolved decisions (post-review — PRD approved 2026-07-22)</w:t>
+      </w:r>
+    </w:p>
+    <w:p>
+      <w:pPr>
+        <w:pStyle w:val="ListParagraph"/>
+        <w:numPr>
+          <w:ilvl w:val="0"/>
+          <w:numId w:val="1"/>
+        </w:numPr>
+        <w:spacing w:after="70"/>
+      </w:pPr>
+      <w:r>
+        <w:rPr>
+          <w:b/>
+          <w:bCs/>
+        </w:rPr>
+        <w:t xml:space="preserve">Curated set — 250 buildings: </w:t>
+      </w:r>
+      <w:r>
+        <w:t xml:space="preserve">every residential building in Brooklyn Community District 3 (Bedford-Stuyvesant), capped at 250 by the ingest (--cd 303 --limit 250). Framed as a complete neighborhood slice, not a hand-picked list — higher trust. Scales to the full ~2,000-building CD3 as a post-grade stretch.</w:t>
+      </w:r>
+    </w:p>
+    <w:p>
+      <w:pPr>
+        <w:pStyle w:val="ListParagraph"/>
+        <w:numPr>
+          <w:ilvl w:val="0"/>
+          <w:numId w:val="1"/>
+        </w:numPr>
+        <w:spacing w:after="70"/>
+      </w:pPr>
+      <w:r>
+        <w:rPr>
+          <w:b/>
+          <w:bCs/>
+        </w:rPr>
+        <w:t xml:space="preserve">Rent-stabilization wording (3-state, honest): </w:t>
+      </w:r>
+      <w:r>
+        <w:t xml:space="preserve">(a) on DHCR record → “Likely rent-stabilized — a signal, not a legal ruling; confirm with DHCR.” (b) not found → “No record found — public lists are incomplete, so not proof it is market-rate.” (c) no data → “Unverified — ask the landlord for the DHCR rent history.” Persistent footnote: “Stabilization data is incomplete by design — a signal, not a verdict.”</w:t>
+      </w:r>
+    </w:p>
+    <w:p>
+      <w:pPr>
+        <w:pStyle w:val="ListParagraph"/>
+        <w:numPr>
+          <w:ilvl w:val="0"/>
+          <w:numId w:val="1"/>
+        </w:numPr>
+        <w:spacing w:after="70"/>
+      </w:pPr>
+      <w:r>
+        <w:rPr>
+          <w:b/>
+          <w:bCs/>
+        </w:rPr>
+        <w:t xml:space="preserve">Backend hosting — Fly.io: </w:t>
+      </w:r>
+      <w:r>
+        <w:t xml:space="preserve">Rust + Axum with the read-only SQLite DB baked into the Docker image (no DB service or volume), scale-to-zero. Frontend (Dioxus 0.6 / WASM) on Vercel.</w:t>
+      </w:r>
+    </w:p>
+    <w:p>
+      <w:pPr>
+        <w:pStyle w:val="ListParagraph"/>
+        <w:numPr>
+          <w:ilvl w:val="0"/>
+          <w:numId w:val="1"/>
+        </w:numPr>
+        <w:spacing w:after="70"/>
+      </w:pPr>
+      <w:r>
+        <w:rPr>
+          <w:b/>
+          <w:bCs/>
+        </w:rPr>
+        <w:t xml:space="preserve">Frontend framework — Dioxus 0.6: </w:t>
+      </w:r>
+      <w:r>
+        <w:t xml:space="preserve">Rust→WASM over the Axum API. Topcoat evaluated and deferred (too early; full-stack, wants to own the server).</w:t>
+      </w:r>
+    </w:p>
+    <w:p>
+      <w:pPr>
+        <w:pStyle w:val="Heading3"/>
+        <w:spacing w:after="100" w:before="200"/>
+      </w:pPr>
+      <w:r>
+        <w:rPr>
+          <w:b/>
+          <w:bCs/>
+          <w:sz w:val="23"/>
+          <w:szCs w:val="23"/>
+        </w:rPr>
+        <w:t xml:space="preserve">F. Deployment &amp; cost (within the $20–50 budget)</w:t>
+      </w:r>
+    </w:p>
+    <w:p>
+      <w:pPr>
+        <w:pStyle w:val="ListParagraph"/>
+        <w:numPr>
+          <w:ilvl w:val="0"/>
+          <w:numId w:val="1"/>
+        </w:numPr>
+        <w:spacing w:after="70"/>
+      </w:pPr>
+      <w:r>
+        <w:rPr>
+          <w:b/>
+          <w:bCs/>
+        </w:rPr>
+        <w:t xml:space="preserve">Data APIs = $0: </w:t>
+      </w:r>
+      <w:r>
+        <w:t xml:space="preserve">NYC Open Data / Socrata (HPD, 311, DOB, DOHMH, MTA — keyless), US Census ACS (free key), GeoSearch address→BBL (keyless). Ingest API cost: $0.</w:t>
+      </w:r>
+    </w:p>
+    <w:p>
+      <w:pPr>
+        <w:pStyle w:val="ListParagraph"/>
+        <w:numPr>
+          <w:ilvl w:val="0"/>
+          <w:numId w:val="1"/>
+        </w:numPr>
+        <w:spacing w:after="70"/>
+      </w:pPr>
+      <w:r>
+        <w:rPr>
+          <w:b/>
+          <w:bCs/>
+        </w:rPr>
+        <w:t xml:space="preserve">Hosting: </w:t>
+      </w:r>
+      <w:r>
+        <w:t xml:space="preserve">Fly.io ~$0–5/month (scale-to-zero). Map tiles via MapLibre GL + Protomaps pmtiles = $0, no key (no Mapbox).</w:t>
+      </w:r>
+    </w:p>
+    <w:p>
+      <w:pPr>
+        <w:pStyle w:val="ListParagraph"/>
+        <w:numPr>
+          <w:ilvl w:val="0"/>
+          <w:numId w:val="1"/>
+        </w:numPr>
+        <w:spacing w:after="70"/>
+      </w:pPr>
+      <w:r>
+        <w:rPr>
+          <w:b/>
+          <w:bCs/>
+        </w:rPr>
+        <w:t xml:space="preserve">Secrets (OS keychain locally / Fly secrets in prod, never in the repo): </w:t>
+      </w:r>
+      <w:r>
+        <w:t xml:space="preserve">CENSUS_API_KEY (required); NYC_APP_TOKEN (free Socrata app token, recommended to avoid rate limits).</w:t>
+      </w:r>
+    </w:p>
+    <w:p>
+      <w:pPr>
+        <w:pStyle w:val="ListParagraph"/>
+        <w:numPr>
+          <w:ilvl w:val="0"/>
+          <w:numId w:val="1"/>
+        </w:numPr>
+        <w:spacing w:after="70"/>
+      </w:pPr>
+      <w:r>
+        <w:rPr>
+          <w:b/>
+          <w:bCs/>
+        </w:rPr>
+        <w:t xml:space="preserve">Total ≈ &lt; $10/month </w:t>
+      </w:r>
+      <w:r>
+        <w:t xml:space="preserve">— well within budget. Optional P2: an LLM “what this means for you” card summary via the team’s OpenRouter free model (~$0).</w:t>
       </w:r>
     </w:p>
     <w:sectPr>

</xml_diff>

<commit_message>
docs: add live URL (housecheck-nessa.fly.dev) to PRD + spec; fly.toml from launch
Deployed live on Fly.io. PRD metadata + Appendix F and spec Appendix C now carry
the live URL. fly.toml is the launch-generated config for app housecheck-nessa.
(fly-deploy.yml CI workflow left untracked — needs a FLY_API_TOKEN secret.)

Co-Authored-By: Claude Opus 4.8 <noreply@anthropic.com>
</commit_message>
<xml_diff>
--- a/HouseCheck_PRD.docx
+++ b/HouseCheck_PRD.docx
@@ -71,6 +71,21 @@
       </w:r>
       <w:r>
         <w:t xml:space="preserve">July 21, 2026</w:t>
+      </w:r>
+    </w:p>
+    <w:p>
+      <w:pPr>
+        <w:spacing w:after="140"/>
+      </w:pPr>
+      <w:r>
+        <w:rPr>
+          <w:b/>
+          <w:bCs/>
+        </w:rPr>
+        <w:t xml:space="preserve">Live demo: </w:t>
+      </w:r>
+      <w:r>
+        <w:t xml:space="preserve">https://housecheck-nessa.fly.dev</w:t>
       </w:r>
     </w:p>
     <w:p>
@@ -3853,6 +3868,26 @@
           <w:szCs w:val="23"/>
         </w:rPr>
         <w:t xml:space="preserve">F. Deployment &amp; cost (within the $20–50 budget)</w:t>
+      </w:r>
+    </w:p>
+    <w:p>
+      <w:pPr>
+        <w:pStyle w:val="ListParagraph"/>
+        <w:numPr>
+          <w:ilvl w:val="0"/>
+          <w:numId w:val="1"/>
+        </w:numPr>
+        <w:spacing w:after="70"/>
+      </w:pPr>
+      <w:r>
+        <w:rPr>
+          <w:b/>
+          <w:bCs/>
+        </w:rPr>
+        <w:t xml:space="preserve">Live API — deployed on Fly.io: </w:t>
+      </w:r>
+      <w:r>
+        <w:t xml:space="preserve">https://housecheck-nessa.fly.dev (region ewr, scale-to-zero, read-only DB baked into the image). Verified serving real data.</w:t>
       </w:r>
     </w:p>
     <w:p>

</xml_diff>

<commit_message>
docs: correct 761,352/Class C + HPD-bbl claims (verified real per REBNY + schema); reconcile frontend to React
Co-Authored-By: Claude Opus 4.8 <noreply@anthropic.com>
</commit_message>
<xml_diff>
--- a/HouseCheck_PRD.docx
+++ b/HouseCheck_PRD.docx
@@ -3677,7 +3677,7 @@
         <w:spacing w:after="140"/>
       </w:pPr>
       <w:r>
-        <w:t xml:space="preserve">All statistics in this PRD were independently verified on 2026-07-21. Claims from the original proposal that could not be sourced were removed, specifically: the "761,352 buildings" and "11% Class C" figures attributed to a REBNY 2026 report that contains neither; OpenIgloo's "Index Ventures" backing (actual backers: Gutter Capital, MetroCap, Trend Forward) and its "$1.37M revenue / $4.4M valuation" (unverifiable aggregator estimates). See the design spec's data-integrity ledger for the full list.</w:t>
+        <w:t>All statistics in this PRD were verified against primary sources (initially 2026-07-21; re-verified 2026-07-24). Correction (2026-07-24): the “761,352 residential buildings” and “~11% Class C” figures are REAL and correctly attributed to REBNY Research, “Data Over Rhetoric” (Feb 22, 2026) — the 2026-07-21 check wrongly flagged them as fabricated because that report post-dated the check; they are restored and cited (89% of the 761,352 buildings have no Class C violation over 24 months, so ~11% have at least one; in the multifamily subset of 91,918 buildings, 10% account for 80% of evictions and 50% of violations). Separately, HPD’s Housing Maintenance Code Violations dataset (wvxf-dwi5) has a native bbl column (schema position 40), which we read directly — no reconstruction from block/lot is needed. Still unverified and excluded: OpenIgloo’s “Index Ventures” backing (actual backers: Gutter Capital, MetroCap, Trend Forward) and its “$1.37M revenue / $4.4M valuation” (unverifiable aggregator estimates). See the claim-verification dossier for the full ledger.</w:t>
       </w:r>
     </w:p>
     <w:p>
@@ -3829,31 +3829,27 @@
           <w:b/>
           <w:bCs/>
         </w:rPr>
-        <w:t xml:space="preserve">Backend hosting — Fly.io: </w:t>
-      </w:r>
-      <w:r>
-        <w:t xml:space="preserve">Rust + Axum with the read-only SQLite DB baked into the Docker image (no DB service or volume), scale-to-zero. Frontend (Dioxus 0.6 / WASM) on Vercel.</w:t>
-      </w:r>
-    </w:p>
-    <w:p>
-      <w:pPr>
-        <w:pStyle w:val="ListParagraph"/>
-        <w:numPr>
-          <w:ilvl w:val="0"/>
-          <w:numId w:val="1"/>
-        </w:numPr>
-        <w:spacing w:after="70"/>
-      </w:pPr>
-      <w:r>
-        <w:rPr>
-          <w:b/>
-          <w:bCs/>
-        </w:rPr>
-        <w:t xml:space="preserve">Frontend framework — Dioxus 0.6: </w:t>
-      </w:r>
-      <w:r>
-        <w:t xml:space="preserve">Rust→WASM over the Axum API. Topcoat evaluated and deferred (too early; full-stack, wants to own the server).</w:t>
-      </w:r>
+        <w:t>Backend hosting — Fly.io: Rust + Axum with the read-only SQLite DB baked into the Docker image (no DB service or volume), scale-to-zero. Frontend (React + Vite + Tailwind) on Vercel.</w:t>
+      </w:r>
+      <w:r/>
+    </w:p>
+    <w:p>
+      <w:pPr>
+        <w:pStyle w:val="ListParagraph"/>
+        <w:numPr>
+          <w:ilvl w:val="0"/>
+          <w:numId w:val="1"/>
+        </w:numPr>
+        <w:spacing w:after="70"/>
+      </w:pPr>
+      <w:r>
+        <w:rPr>
+          <w:b/>
+          <w:bCs/>
+        </w:rPr>
+        <w:t>Frontend framework — React + Vite + Tailwind + shadcn/ui over the Axum API (originally specced Dioxus 0.6; the team shipped React). Topcoat evaluated and deferred (too early; full-stack, wants to own the server).</w:t>
+      </w:r>
+      <w:r/>
     </w:p>
     <w:p>
       <w:pPr>

</xml_diff>